<commit_message>
update with Feb 3 script
</commit_message>
<xml_diff>
--- a/Westervelt Climate school Research Computing syllabus.docx
+++ b/Westervelt Climate school Research Computing syllabus.docx
@@ -290,13 +290,23 @@
           <w:szCs w:val="20"/>
         </w:rPr>
       </w:pPr>
-      <w:r>
-        <w:rPr>
-          <w:color w:val="000000"/>
-          <w:sz w:val="20"/>
-          <w:szCs w:val="20"/>
-        </w:rPr>
-        <w:t>Github: dmw2166</w:t>
+      <w:proofErr w:type="spellStart"/>
+      <w:r>
+        <w:rPr>
+          <w:color w:val="000000"/>
+          <w:sz w:val="20"/>
+          <w:szCs w:val="20"/>
+        </w:rPr>
+        <w:t>Github</w:t>
+      </w:r>
+      <w:proofErr w:type="spellEnd"/>
+      <w:r>
+        <w:rPr>
+          <w:color w:val="000000"/>
+          <w:sz w:val="20"/>
+          <w:szCs w:val="20"/>
+        </w:rPr>
+        <w:t>: dmw2166</w:t>
       </w:r>
     </w:p>
     <w:p>
@@ -474,13 +484,23 @@
           <w:color w:val="000000"/>
         </w:rPr>
       </w:pPr>
+      <w:proofErr w:type="spellStart"/>
       <w:r>
         <w:rPr>
           <w:rFonts w:ascii="Calibri" w:eastAsia="Calibri" w:hAnsi="Calibri" w:cs="Calibri"/>
           <w:bCs/>
           <w:color w:val="000000"/>
         </w:rPr>
-        <w:t>Github:</w:t>
+        <w:t>Github</w:t>
+      </w:r>
+      <w:proofErr w:type="spellEnd"/>
+      <w:r>
+        <w:rPr>
+          <w:rFonts w:ascii="Calibri" w:eastAsia="Calibri" w:hAnsi="Calibri" w:cs="Calibri"/>
+          <w:bCs/>
+          <w:color w:val="000000"/>
+        </w:rPr>
+        <w:t>:</w:t>
       </w:r>
       <w:r>
         <w:rPr>
@@ -746,7 +766,23 @@
           <w:rFonts w:ascii="Calibri" w:eastAsia="Times New Roman" w:hAnsi="Calibri" w:cs="Calibri"/>
           <w:color w:val="000000"/>
         </w:rPr>
-        <w:t>shell scripting, terminal commands, git/github, and other techniques.</w:t>
+        <w:t>shell scripting, terminal commands, git/</w:t>
+      </w:r>
+      <w:proofErr w:type="spellStart"/>
+      <w:r>
+        <w:rPr>
+          <w:rFonts w:ascii="Calibri" w:eastAsia="Times New Roman" w:hAnsi="Calibri" w:cs="Calibri"/>
+          <w:color w:val="000000"/>
+        </w:rPr>
+        <w:t>github</w:t>
+      </w:r>
+      <w:proofErr w:type="spellEnd"/>
+      <w:r>
+        <w:rPr>
+          <w:rFonts w:ascii="Calibri" w:eastAsia="Times New Roman" w:hAnsi="Calibri" w:cs="Calibri"/>
+          <w:color w:val="000000"/>
+        </w:rPr>
+        <w:t>, and other techniques.</w:t>
       </w:r>
     </w:p>
     <w:p>
@@ -930,7 +966,27 @@
           <w:szCs w:val="20"/>
           <w:highlight w:val="white"/>
         </w:rPr>
-        <w:t>Navigate the JupyterLab Environment effectively</w:t>
+        <w:t xml:space="preserve">Navigate the </w:t>
+      </w:r>
+      <w:proofErr w:type="spellStart"/>
+      <w:r>
+        <w:rPr>
+          <w:color w:val="000000"/>
+          <w:sz w:val="20"/>
+          <w:szCs w:val="20"/>
+          <w:highlight w:val="white"/>
+        </w:rPr>
+        <w:t>JupyterLab</w:t>
+      </w:r>
+      <w:proofErr w:type="spellEnd"/>
+      <w:r>
+        <w:rPr>
+          <w:color w:val="000000"/>
+          <w:sz w:val="20"/>
+          <w:szCs w:val="20"/>
+          <w:highlight w:val="white"/>
+        </w:rPr>
+        <w:t xml:space="preserve"> Environment effectively</w:t>
       </w:r>
     </w:p>
     <w:p>
@@ -1394,6 +1450,7 @@
           <w:highlight w:val="yellow"/>
         </w:rPr>
       </w:pPr>
+      <w:proofErr w:type="spellStart"/>
       <w:r>
         <w:rPr>
           <w:color w:val="000000"/>
@@ -1402,6 +1459,7 @@
         </w:rPr>
         <w:t>Courseworks</w:t>
       </w:r>
+      <w:proofErr w:type="spellEnd"/>
       <w:r>
         <w:rPr>
           <w:color w:val="000000"/>
@@ -1523,7 +1581,23 @@
           <w:rFonts w:ascii="Calibri" w:eastAsia="Calibri" w:hAnsi="Calibri" w:cs="Calibri"/>
           <w:color w:val="000000"/>
         </w:rPr>
-        <w:t xml:space="preserve"> available on github: </w:t>
+        <w:t xml:space="preserve"> available on </w:t>
+      </w:r>
+      <w:proofErr w:type="spellStart"/>
+      <w:r>
+        <w:rPr>
+          <w:rFonts w:ascii="Calibri" w:eastAsia="Calibri" w:hAnsi="Calibri" w:cs="Calibri"/>
+          <w:color w:val="000000"/>
+        </w:rPr>
+        <w:t>github</w:t>
+      </w:r>
+      <w:proofErr w:type="spellEnd"/>
+      <w:r>
+        <w:rPr>
+          <w:rFonts w:ascii="Calibri" w:eastAsia="Calibri" w:hAnsi="Calibri" w:cs="Calibri"/>
+          <w:color w:val="000000"/>
+        </w:rPr>
+        <w:t xml:space="preserve">: </w:t>
       </w:r>
       <w:hyperlink r:id="rId8" w:history="1">
         <w:r>
@@ -1642,8 +1716,17 @@
           <w:rFonts w:ascii="Calibri" w:eastAsia="Calibri" w:hAnsi="Calibri" w:cs="Calibri"/>
           <w:color w:val="000000"/>
         </w:rPr>
-        <w:t>Python for Data Analysis: Data Wrangling with pandas, NumPy, and Jupyter</w:t>
-      </w:r>
+        <w:t xml:space="preserve">Python for Data Analysis: Data Wrangling with pandas, NumPy, and </w:t>
+      </w:r>
+      <w:proofErr w:type="spellStart"/>
+      <w:r>
+        <w:rPr>
+          <w:rFonts w:ascii="Calibri" w:eastAsia="Calibri" w:hAnsi="Calibri" w:cs="Calibri"/>
+          <w:color w:val="000000"/>
+        </w:rPr>
+        <w:t>Jupyter</w:t>
+      </w:r>
+      <w:proofErr w:type="spellEnd"/>
       <w:r>
         <w:rPr>
           <w:rFonts w:ascii="Calibri" w:eastAsia="Calibri" w:hAnsi="Calibri" w:cs="Calibri"/>
@@ -2421,7 +2504,79 @@
           <w:sz w:val="20"/>
           <w:szCs w:val="20"/>
         </w:rPr>
-        <w:t xml:space="preserve"> on Tuesdays. Assignments will be posted on Courseworks. To turn in assignments, you will simply push your code/notebooks to an assignments repository on your github, and you will make the professor (Github: dmw2166) and TA</w:t>
+        <w:t xml:space="preserve"> on Tuesdays. Assignments will be posted on </w:t>
+      </w:r>
+      <w:proofErr w:type="spellStart"/>
+      <w:r>
+        <w:rPr>
+          <w:color w:val="000000"/>
+          <w:sz w:val="20"/>
+          <w:szCs w:val="20"/>
+        </w:rPr>
+        <w:t>Courseworks</w:t>
+      </w:r>
+      <w:proofErr w:type="spellEnd"/>
+      <w:r>
+        <w:rPr>
+          <w:color w:val="000000"/>
+          <w:sz w:val="20"/>
+          <w:szCs w:val="20"/>
+        </w:rPr>
+        <w:t xml:space="preserve">. To turn in assignments, you will simply push your code/notebooks to an </w:t>
+      </w:r>
+      <w:proofErr w:type="gramStart"/>
+      <w:r>
+        <w:rPr>
+          <w:color w:val="000000"/>
+          <w:sz w:val="20"/>
+          <w:szCs w:val="20"/>
+        </w:rPr>
+        <w:t>assignments</w:t>
+      </w:r>
+      <w:proofErr w:type="gramEnd"/>
+      <w:r>
+        <w:rPr>
+          <w:color w:val="000000"/>
+          <w:sz w:val="20"/>
+          <w:szCs w:val="20"/>
+        </w:rPr>
+        <w:t xml:space="preserve"> repository on your </w:t>
+      </w:r>
+      <w:proofErr w:type="spellStart"/>
+      <w:r>
+        <w:rPr>
+          <w:color w:val="000000"/>
+          <w:sz w:val="20"/>
+          <w:szCs w:val="20"/>
+        </w:rPr>
+        <w:t>github</w:t>
+      </w:r>
+      <w:proofErr w:type="spellEnd"/>
+      <w:r>
+        <w:rPr>
+          <w:color w:val="000000"/>
+          <w:sz w:val="20"/>
+          <w:szCs w:val="20"/>
+        </w:rPr>
+        <w:t>, and you will make the professor (</w:t>
+      </w:r>
+      <w:proofErr w:type="spellStart"/>
+      <w:r>
+        <w:rPr>
+          <w:color w:val="000000"/>
+          <w:sz w:val="20"/>
+          <w:szCs w:val="20"/>
+        </w:rPr>
+        <w:t>Github</w:t>
+      </w:r>
+      <w:proofErr w:type="spellEnd"/>
+      <w:r>
+        <w:rPr>
+          <w:color w:val="000000"/>
+          <w:sz w:val="20"/>
+          <w:szCs w:val="20"/>
+        </w:rPr>
+        <w:t>: dmw2166) and TA</w:t>
       </w:r>
       <w:r>
         <w:rPr>
@@ -2439,13 +2594,23 @@
         </w:rPr>
         <w:t xml:space="preserve"> (</w:t>
       </w:r>
-      <w:r>
-        <w:rPr>
-          <w:color w:val="000000"/>
-          <w:sz w:val="20"/>
-          <w:szCs w:val="20"/>
-        </w:rPr>
-        <w:t xml:space="preserve">Github: </w:t>
+      <w:proofErr w:type="spellStart"/>
+      <w:r>
+        <w:rPr>
+          <w:color w:val="000000"/>
+          <w:sz w:val="20"/>
+          <w:szCs w:val="20"/>
+        </w:rPr>
+        <w:t>Github</w:t>
+      </w:r>
+      <w:proofErr w:type="spellEnd"/>
+      <w:r>
+        <w:rPr>
+          <w:color w:val="000000"/>
+          <w:sz w:val="20"/>
+          <w:szCs w:val="20"/>
+        </w:rPr>
+        <w:t xml:space="preserve">: </w:t>
       </w:r>
       <w:r>
         <w:rPr>
@@ -2524,7 +2689,23 @@
           <w:sz w:val="20"/>
           <w:szCs w:val="20"/>
         </w:rPr>
-        <w:t xml:space="preserve">In your submission, you MUST list your collaborators in a commented line in the first cell of your Jupyter notebook. </w:t>
+        <w:t xml:space="preserve">In your submission, you MUST list your collaborators in a commented line in the first cell of your </w:t>
+      </w:r>
+      <w:proofErr w:type="spellStart"/>
+      <w:r>
+        <w:rPr>
+          <w:sz w:val="20"/>
+          <w:szCs w:val="20"/>
+        </w:rPr>
+        <w:t>Jupyter</w:t>
+      </w:r>
+      <w:proofErr w:type="spellEnd"/>
+      <w:r>
+        <w:rPr>
+          <w:sz w:val="20"/>
+          <w:szCs w:val="20"/>
+        </w:rPr>
+        <w:t xml:space="preserve"> notebook. </w:t>
       </w:r>
       <w:r>
         <w:rPr>
@@ -2637,7 +2818,25 @@
           <w:sz w:val="20"/>
           <w:szCs w:val="20"/>
         </w:rPr>
-        <w:t>, as long as students submit an independent, unique project accurately representing their understanding. The project will synthesize many topics we cover over the course of the semester. Broadly, students will be asked to pick a dataset, and use this dataset to investigate a scientific question or hypothesis. They will use the coding skills to create figures (in a Jupyter notebook) that provides insight regarding the scientific question or hypothesis. There will also be a 5-minute presentation on the project. Students are welcome to use datasets related to their research</w:t>
+        <w:t xml:space="preserve">, as long as students submit an independent, unique project accurately representing their understanding. The project will synthesize many topics we cover over the course of the semester. Broadly, students will be asked to pick a dataset, and use this dataset to investigate a scientific question or hypothesis. They will use the coding skills to create figures (in a </w:t>
+      </w:r>
+      <w:proofErr w:type="spellStart"/>
+      <w:r>
+        <w:rPr>
+          <w:color w:val="000000"/>
+          <w:sz w:val="20"/>
+          <w:szCs w:val="20"/>
+        </w:rPr>
+        <w:t>Jupyter</w:t>
+      </w:r>
+      <w:proofErr w:type="spellEnd"/>
+      <w:r>
+        <w:rPr>
+          <w:color w:val="000000"/>
+          <w:sz w:val="20"/>
+          <w:szCs w:val="20"/>
+        </w:rPr>
+        <w:t xml:space="preserve"> notebook) that provides insight regarding the scientific question or hypothesis. There will also be a 5-minute presentation on the project. Students are welcome to use datasets related to their research</w:t>
       </w:r>
       <w:r>
         <w:rPr>
@@ -2774,7 +2973,25 @@
           <w:sz w:val="20"/>
           <w:szCs w:val="20"/>
         </w:rPr>
-        <w:t xml:space="preserve">All assignments should be submitted via CourseWorks by the due date and time. That said, we understand when illnesses, burnout, research travel, job interviews, or other things get in the way of work and school. Each student will have up to 5 total days of “no questions asked” extensions that they may use on any assignment. This is 5 cumulative days, meaning students could use a 1-day (24 hour) extension 5 times, or a 5-day extension one time, or anything in between. Note that weekends don’t count towards the 5-day tally. For example, a 24-hour extension of an assignment due Friday afternoon would extend to Monday afternoon. Extensions are given in 1-day increments, so submitting a homework 1 minute late uses up 1 day of your extension. </w:t>
+        <w:t xml:space="preserve">All assignments should be submitted via </w:t>
+      </w:r>
+      <w:proofErr w:type="spellStart"/>
+      <w:r>
+        <w:rPr>
+          <w:color w:val="252525"/>
+          <w:sz w:val="20"/>
+          <w:szCs w:val="20"/>
+        </w:rPr>
+        <w:t>CourseWorks</w:t>
+      </w:r>
+      <w:proofErr w:type="spellEnd"/>
+      <w:r>
+        <w:rPr>
+          <w:color w:val="252525"/>
+          <w:sz w:val="20"/>
+          <w:szCs w:val="20"/>
+        </w:rPr>
+        <w:t xml:space="preserve"> by the due date and time. That said, we understand when illnesses, burnout, research travel, job interviews, or other things get in the way of work and school. Each student will have up to 5 total days of “no questions asked” extensions that they may use on any assignment. This is 5 cumulative days, meaning students could use a 1-day (24 hour) extension 5 times, or a 5-day extension one time, or anything in between. Note that weekends don’t count towards the 5-day tally. For example, a 24-hour extension of an assignment due Friday afternoon would extend to Monday afternoon. Extensions are given in 1-day increments, so submitting a homework 1 minute late uses up 1 day of your extension. </w:t>
       </w:r>
       <w:r>
         <w:rPr>
@@ -3177,13 +3394,22 @@
           <w:color w:val="000000"/>
         </w:rPr>
       </w:pPr>
+      <w:proofErr w:type="gramStart"/>
       <w:r>
         <w:rPr>
           <w:rFonts w:ascii="Calibri" w:eastAsia="Calibri" w:hAnsi="Calibri" w:cs="Calibri"/>
           <w:color w:val="000000"/>
         </w:rPr>
         <w:lastRenderedPageBreak/>
-        <w:t xml:space="preserve">A          </w:t>
+        <w:t>A</w:t>
+      </w:r>
+      <w:proofErr w:type="gramEnd"/>
+      <w:r>
+        <w:rPr>
+          <w:rFonts w:ascii="Calibri" w:eastAsia="Calibri" w:hAnsi="Calibri" w:cs="Calibri"/>
+          <w:color w:val="000000"/>
+        </w:rPr>
+        <w:t xml:space="preserve">          </w:t>
       </w:r>
       <w:r>
         <w:rPr>
@@ -3871,20 +4097,61 @@
                 <w:szCs w:val="20"/>
               </w:rPr>
             </w:pPr>
-            <w:r>
-              <w:rPr>
-                <w:sz w:val="20"/>
-                <w:szCs w:val="20"/>
-              </w:rPr>
-              <w:t>JupyterLab</w:t>
-            </w:r>
-            <w:r>
-              <w:rPr>
-                <w:sz w:val="20"/>
-                <w:szCs w:val="20"/>
-              </w:rPr>
-              <w:t>, git, github</w:t>
-            </w:r>
+            <w:hyperlink r:id="rId10" w:history="1">
+              <w:proofErr w:type="spellStart"/>
+              <w:r>
+                <w:rPr>
+                  <w:rStyle w:val="Hyperlink"/>
+                  <w:sz w:val="20"/>
+                  <w:szCs w:val="20"/>
+                </w:rPr>
+                <w:t>Jupy</w:t>
+              </w:r>
+              <w:r>
+                <w:rPr>
+                  <w:rStyle w:val="Hyperlink"/>
+                  <w:sz w:val="20"/>
+                  <w:szCs w:val="20"/>
+                </w:rPr>
+                <w:t>t</w:t>
+              </w:r>
+              <w:r>
+                <w:rPr>
+                  <w:rStyle w:val="Hyperlink"/>
+                  <w:sz w:val="20"/>
+                  <w:szCs w:val="20"/>
+                </w:rPr>
+                <w:t>erLab</w:t>
+              </w:r>
+              <w:proofErr w:type="spellEnd"/>
+            </w:hyperlink>
+            <w:r>
+              <w:rPr>
+                <w:sz w:val="20"/>
+                <w:szCs w:val="20"/>
+              </w:rPr>
+              <w:t xml:space="preserve">, </w:t>
+            </w:r>
+            <w:hyperlink r:id="rId11" w:history="1">
+              <w:r>
+                <w:rPr>
+                  <w:rStyle w:val="Hyperlink"/>
+                  <w:sz w:val="20"/>
+                  <w:szCs w:val="20"/>
+                </w:rPr>
+                <w:t xml:space="preserve">git, </w:t>
+              </w:r>
+              <w:proofErr w:type="spellStart"/>
+              <w:r>
+                <w:rPr>
+                  <w:rStyle w:val="Hyperlink"/>
+                  <w:sz w:val="20"/>
+                  <w:szCs w:val="20"/>
+                </w:rPr>
+                <w:t>github</w:t>
+              </w:r>
+              <w:proofErr w:type="spellEnd"/>
+            </w:hyperlink>
           </w:p>
         </w:tc>
         <w:tc>
@@ -3944,8 +4211,17 @@
                 <w:sz w:val="20"/>
                 <w:szCs w:val="20"/>
               </w:rPr>
-              <w:t>Assignment 0: sign up for Github</w:t>
-            </w:r>
+              <w:t xml:space="preserve">Assignment 0: sign up for </w:t>
+            </w:r>
+            <w:proofErr w:type="spellStart"/>
+            <w:r>
+              <w:rPr>
+                <w:sz w:val="20"/>
+                <w:szCs w:val="20"/>
+              </w:rPr>
+              <w:t>Github</w:t>
+            </w:r>
+            <w:proofErr w:type="spellEnd"/>
           </w:p>
         </w:tc>
       </w:tr>
@@ -4013,13 +4289,16 @@
                 <w:szCs w:val="20"/>
               </w:rPr>
             </w:pPr>
-            <w:r>
-              <w:rPr>
-                <w:sz w:val="20"/>
-                <w:szCs w:val="20"/>
-              </w:rPr>
-              <w:t>Unix</w:t>
-            </w:r>
+            <w:hyperlink r:id="rId12" w:history="1">
+              <w:r>
+                <w:rPr>
+                  <w:rStyle w:val="Hyperlink"/>
+                  <w:sz w:val="20"/>
+                  <w:szCs w:val="20"/>
+                </w:rPr>
+                <w:t>Unix</w:t>
+              </w:r>
+            </w:hyperlink>
           </w:p>
         </w:tc>
         <w:tc>
@@ -4075,8 +4354,17 @@
                 <w:sz w:val="20"/>
                 <w:szCs w:val="20"/>
               </w:rPr>
-              <w:t>: Files, Git, Github</w:t>
-            </w:r>
+              <w:t xml:space="preserve">: Files, Git, </w:t>
+            </w:r>
+            <w:proofErr w:type="spellStart"/>
+            <w:r>
+              <w:rPr>
+                <w:sz w:val="20"/>
+                <w:szCs w:val="20"/>
+              </w:rPr>
+              <w:t>Github</w:t>
+            </w:r>
+            <w:proofErr w:type="spellEnd"/>
           </w:p>
         </w:tc>
       </w:tr>
@@ -4143,13 +4431,16 @@
                 <w:szCs w:val="20"/>
               </w:rPr>
             </w:pPr>
-            <w:r>
-              <w:rPr>
-                <w:sz w:val="20"/>
-                <w:szCs w:val="20"/>
-              </w:rPr>
-              <w:t>All About Data</w:t>
-            </w:r>
+            <w:hyperlink r:id="rId13" w:history="1">
+              <w:r>
+                <w:rPr>
+                  <w:rStyle w:val="Hyperlink"/>
+                  <w:sz w:val="20"/>
+                  <w:szCs w:val="20"/>
+                </w:rPr>
+                <w:t>All About Data</w:t>
+              </w:r>
+            </w:hyperlink>
           </w:p>
         </w:tc>
         <w:tc>
@@ -4270,13 +4561,16 @@
                 <w:szCs w:val="20"/>
               </w:rPr>
             </w:pPr>
-            <w:r>
-              <w:rPr>
-                <w:sz w:val="20"/>
-                <w:szCs w:val="20"/>
-              </w:rPr>
-              <w:t>Python fundamentals</w:t>
-            </w:r>
+            <w:hyperlink r:id="rId14" w:history="1">
+              <w:r>
+                <w:rPr>
+                  <w:rStyle w:val="Hyperlink"/>
+                  <w:sz w:val="20"/>
+                  <w:szCs w:val="20"/>
+                </w:rPr>
+                <w:t>Python fundamentals</w:t>
+              </w:r>
+            </w:hyperlink>
           </w:p>
         </w:tc>
         <w:tc>
@@ -4411,13 +4705,36 @@
                 <w:szCs w:val="20"/>
               </w:rPr>
             </w:pPr>
-            <w:r>
-              <w:rPr>
-                <w:sz w:val="20"/>
-                <w:szCs w:val="20"/>
-              </w:rPr>
-              <w:t>Numpy and Scipy</w:t>
-            </w:r>
+            <w:hyperlink r:id="rId15" w:history="1">
+              <w:proofErr w:type="spellStart"/>
+              <w:r>
+                <w:rPr>
+                  <w:rStyle w:val="Hyperlink"/>
+                  <w:sz w:val="20"/>
+                  <w:szCs w:val="20"/>
+                </w:rPr>
+                <w:t>Numpy</w:t>
+              </w:r>
+              <w:proofErr w:type="spellEnd"/>
+              <w:r>
+                <w:rPr>
+                  <w:rStyle w:val="Hyperlink"/>
+                  <w:sz w:val="20"/>
+                  <w:szCs w:val="20"/>
+                </w:rPr>
+                <w:t xml:space="preserve"> and </w:t>
+              </w:r>
+              <w:proofErr w:type="spellStart"/>
+              <w:r>
+                <w:rPr>
+                  <w:rStyle w:val="Hyperlink"/>
+                  <w:sz w:val="20"/>
+                  <w:szCs w:val="20"/>
+                </w:rPr>
+                <w:t>Scipy</w:t>
+              </w:r>
+              <w:proofErr w:type="spellEnd"/>
+            </w:hyperlink>
           </w:p>
         </w:tc>
         <w:tc>
@@ -4525,13 +4842,44 @@
                 <w:szCs w:val="20"/>
               </w:rPr>
             </w:pPr>
-            <w:r>
-              <w:rPr>
-                <w:sz w:val="20"/>
-                <w:szCs w:val="20"/>
-              </w:rPr>
-              <w:t>Numpy, Scipy, and Matplotlib</w:t>
-            </w:r>
+            <w:hyperlink r:id="rId16" w:history="1">
+              <w:proofErr w:type="spellStart"/>
+              <w:r>
+                <w:rPr>
+                  <w:rStyle w:val="Hyperlink"/>
+                  <w:sz w:val="20"/>
+                  <w:szCs w:val="20"/>
+                </w:rPr>
+                <w:t>Numpy</w:t>
+              </w:r>
+              <w:proofErr w:type="spellEnd"/>
+              <w:r>
+                <w:rPr>
+                  <w:rStyle w:val="Hyperlink"/>
+                  <w:sz w:val="20"/>
+                  <w:szCs w:val="20"/>
+                </w:rPr>
+                <w:t xml:space="preserve">, </w:t>
+              </w:r>
+              <w:proofErr w:type="spellStart"/>
+              <w:r>
+                <w:rPr>
+                  <w:rStyle w:val="Hyperlink"/>
+                  <w:sz w:val="20"/>
+                  <w:szCs w:val="20"/>
+                </w:rPr>
+                <w:t>Scipy</w:t>
+              </w:r>
+              <w:proofErr w:type="spellEnd"/>
+              <w:r>
+                <w:rPr>
+                  <w:rStyle w:val="Hyperlink"/>
+                  <w:sz w:val="20"/>
+                  <w:szCs w:val="20"/>
+                </w:rPr>
+                <w:t>, and Matplotlib</w:t>
+              </w:r>
+            </w:hyperlink>
           </w:p>
         </w:tc>
         <w:tc>
@@ -4577,7 +4925,23 @@
                 <w:sz w:val="20"/>
                 <w:szCs w:val="20"/>
               </w:rPr>
-              <w:t>: Numpy and matplotlib</w:t>
+              <w:t xml:space="preserve">: </w:t>
+            </w:r>
+            <w:proofErr w:type="spellStart"/>
+            <w:r>
+              <w:rPr>
+                <w:sz w:val="20"/>
+                <w:szCs w:val="20"/>
+              </w:rPr>
+              <w:t>Numpy</w:t>
+            </w:r>
+            <w:proofErr w:type="spellEnd"/>
+            <w:r>
+              <w:rPr>
+                <w:sz w:val="20"/>
+                <w:szCs w:val="20"/>
+              </w:rPr>
+              <w:t xml:space="preserve"> and matplotlib</w:t>
             </w:r>
           </w:p>
         </w:tc>
@@ -4671,7 +5035,23 @@
                 <w:sz w:val="20"/>
                 <w:szCs w:val="20"/>
               </w:rPr>
-              <w:t>Datetime, climatologies, anomalies, filtering, detrending</w:t>
+              <w:t xml:space="preserve">Datetime, </w:t>
+            </w:r>
+            <w:proofErr w:type="spellStart"/>
+            <w:r>
+              <w:rPr>
+                <w:sz w:val="20"/>
+                <w:szCs w:val="20"/>
+              </w:rPr>
+              <w:t>climatologies</w:t>
+            </w:r>
+            <w:proofErr w:type="spellEnd"/>
+            <w:r>
+              <w:rPr>
+                <w:sz w:val="20"/>
+                <w:szCs w:val="20"/>
+              </w:rPr>
+              <w:t>, anomalies, filtering, detrending</w:t>
             </w:r>
           </w:p>
         </w:tc>
@@ -4859,13 +5239,16 @@
                 <w:szCs w:val="20"/>
               </w:rPr>
             </w:pPr>
-            <w:r>
-              <w:rPr>
-                <w:sz w:val="20"/>
-                <w:szCs w:val="20"/>
-              </w:rPr>
-              <w:t>Pandas Part 1</w:t>
-            </w:r>
+            <w:hyperlink r:id="rId17" w:history="1">
+              <w:r>
+                <w:rPr>
+                  <w:rStyle w:val="Hyperlink"/>
+                  <w:sz w:val="20"/>
+                  <w:szCs w:val="20"/>
+                </w:rPr>
+                <w:t>Pandas Part 1</w:t>
+              </w:r>
+            </w:hyperlink>
           </w:p>
         </w:tc>
         <w:tc>
@@ -4880,12 +5263,21 @@
                 <w:szCs w:val="20"/>
               </w:rPr>
             </w:pPr>
-            <w:r>
-              <w:rPr>
-                <w:sz w:val="20"/>
-                <w:szCs w:val="20"/>
-              </w:rPr>
-              <w:t>Dataframes, resampling, reading files</w:t>
+            <w:proofErr w:type="spellStart"/>
+            <w:r>
+              <w:rPr>
+                <w:sz w:val="20"/>
+                <w:szCs w:val="20"/>
+              </w:rPr>
+              <w:t>Dataframes</w:t>
+            </w:r>
+            <w:proofErr w:type="spellEnd"/>
+            <w:r>
+              <w:rPr>
+                <w:sz w:val="20"/>
+                <w:szCs w:val="20"/>
+              </w:rPr>
+              <w:t>, resampling, reading files</w:t>
             </w:r>
           </w:p>
         </w:tc>
@@ -4896,23 +5288,24 @@
           <w:p>
             <w:pPr>
               <w:rPr>
+                <w:color w:val="000000" w:themeColor="text1"/>
                 <w:sz w:val="20"/>
                 <w:szCs w:val="20"/>
               </w:rPr>
             </w:pPr>
             <w:r>
               <w:rPr>
-                <w:sz w:val="20"/>
-                <w:szCs w:val="20"/>
-                <w:highlight w:val="yellow"/>
+                <w:color w:val="000000" w:themeColor="text1"/>
+                <w:sz w:val="20"/>
+                <w:szCs w:val="20"/>
               </w:rPr>
               <w:t>Assignment 7</w:t>
             </w:r>
             <w:r>
               <w:rPr>
-                <w:sz w:val="20"/>
-                <w:szCs w:val="20"/>
-                <w:highlight w:val="yellow"/>
+                <w:color w:val="000000" w:themeColor="text1"/>
+                <w:sz w:val="20"/>
+                <w:szCs w:val="20"/>
               </w:rPr>
               <w:t>: Time series</w:t>
             </w:r>
@@ -4971,12 +5364,41 @@
           <w:p>
             <w:pPr>
               <w:rPr>
+                <w:rStyle w:val="Hyperlink"/>
                 <w:sz w:val="20"/>
                 <w:szCs w:val="20"/>
               </w:rPr>
             </w:pPr>
             <w:r>
               <w:rPr>
+                <w:sz w:val="20"/>
+                <w:szCs w:val="20"/>
+              </w:rPr>
+              <w:fldChar w:fldCharType="begin"/>
+            </w:r>
+            <w:r>
+              <w:rPr>
+                <w:sz w:val="20"/>
+                <w:szCs w:val="20"/>
+              </w:rPr>
+              <w:instrText>HYPERLINK "https://dmw2166.github.io/comp-res-climate-data-sci/lectures/pandas/pandas_groupby.html"</w:instrText>
+            </w:r>
+            <w:r>
+              <w:rPr>
+                <w:sz w:val="20"/>
+                <w:szCs w:val="20"/>
+              </w:rPr>
+            </w:r>
+            <w:r>
+              <w:rPr>
+                <w:sz w:val="20"/>
+                <w:szCs w:val="20"/>
+              </w:rPr>
+              <w:fldChar w:fldCharType="separate"/>
+            </w:r>
+            <w:r>
+              <w:rPr>
+                <w:rStyle w:val="Hyperlink"/>
                 <w:sz w:val="20"/>
                 <w:szCs w:val="20"/>
               </w:rPr>
@@ -4992,10 +5414,18 @@
             </w:pPr>
             <w:r>
               <w:rPr>
+                <w:rStyle w:val="Hyperlink"/>
                 <w:sz w:val="20"/>
                 <w:szCs w:val="20"/>
               </w:rPr>
               <w:t>&amp; Seaborn</w:t>
+            </w:r>
+            <w:r>
+              <w:rPr>
+                <w:sz w:val="20"/>
+                <w:szCs w:val="20"/>
+              </w:rPr>
+              <w:fldChar w:fldCharType="end"/>
             </w:r>
           </w:p>
         </w:tc>
@@ -5015,7 +5445,23 @@
                 <w:sz w:val="20"/>
                 <w:szCs w:val="20"/>
               </w:rPr>
-              <w:t>Plots, groupby, merging</w:t>
+              <w:t xml:space="preserve">Plots, </w:t>
+            </w:r>
+            <w:proofErr w:type="spellStart"/>
+            <w:r>
+              <w:rPr>
+                <w:sz w:val="20"/>
+                <w:szCs w:val="20"/>
+              </w:rPr>
+              <w:t>groupby</w:t>
+            </w:r>
+            <w:proofErr w:type="spellEnd"/>
+            <w:r>
+              <w:rPr>
+                <w:sz w:val="20"/>
+                <w:szCs w:val="20"/>
+              </w:rPr>
+              <w:t>, merging</w:t>
             </w:r>
           </w:p>
         </w:tc>
@@ -5026,14 +5472,14 @@
           <w:p>
             <w:pPr>
               <w:rPr>
-                <w:color w:val="00B050"/>
+                <w:color w:val="000000" w:themeColor="text1"/>
                 <w:sz w:val="20"/>
                 <w:szCs w:val="20"/>
               </w:rPr>
             </w:pPr>
             <w:r>
               <w:rPr>
-                <w:color w:val="00B050"/>
+                <w:color w:val="000000" w:themeColor="text1"/>
                 <w:sz w:val="20"/>
                 <w:szCs w:val="20"/>
               </w:rPr>
@@ -5041,7 +5487,7 @@
             </w:r>
             <w:r>
               <w:rPr>
-                <w:color w:val="00B050"/>
+                <w:color w:val="000000" w:themeColor="text1"/>
                 <w:sz w:val="20"/>
                 <w:szCs w:val="20"/>
               </w:rPr>
@@ -5114,13 +5560,16 @@
                 <w:szCs w:val="20"/>
               </w:rPr>
             </w:pPr>
-            <w:r>
-              <w:rPr>
-                <w:sz w:val="20"/>
-                <w:szCs w:val="20"/>
-              </w:rPr>
-              <w:t>Gridded data</w:t>
-            </w:r>
+            <w:hyperlink r:id="rId18" w:history="1">
+              <w:r>
+                <w:rPr>
+                  <w:rStyle w:val="Hyperlink"/>
+                  <w:sz w:val="20"/>
+                  <w:szCs w:val="20"/>
+                </w:rPr>
+                <w:t>Gridded data</w:t>
+              </w:r>
+            </w:hyperlink>
           </w:p>
         </w:tc>
         <w:tc>
@@ -5134,6 +5583,7 @@
                 <w:szCs w:val="20"/>
               </w:rPr>
             </w:pPr>
+            <w:proofErr w:type="spellStart"/>
             <w:r>
               <w:rPr>
                 <w:sz w:val="20"/>
@@ -5153,7 +5603,15 @@
                 <w:sz w:val="20"/>
                 <w:szCs w:val="20"/>
               </w:rPr>
-              <w:t>y, map projections, interpolation</w:t>
+              <w:t>y</w:t>
+            </w:r>
+            <w:proofErr w:type="spellEnd"/>
+            <w:r>
+              <w:rPr>
+                <w:sz w:val="20"/>
+                <w:szCs w:val="20"/>
+              </w:rPr>
+              <w:t>, map projections, interpolation</w:t>
             </w:r>
           </w:p>
         </w:tc>
@@ -5172,7 +5630,6 @@
               <w:rPr>
                 <w:sz w:val="20"/>
                 <w:szCs w:val="20"/>
-                <w:highlight w:val="yellow"/>
               </w:rPr>
               <w:t xml:space="preserve">Assignment </w:t>
             </w:r>
@@ -5180,7 +5637,6 @@
               <w:rPr>
                 <w:sz w:val="20"/>
                 <w:szCs w:val="20"/>
-                <w:highlight w:val="yellow"/>
               </w:rPr>
               <w:t>9</w:t>
             </w:r>
@@ -5188,10 +5644,18 @@
               <w:rPr>
                 <w:sz w:val="20"/>
                 <w:szCs w:val="20"/>
-                <w:highlight w:val="yellow"/>
-              </w:rPr>
-              <w:t>: Pandas groupby</w:t>
-            </w:r>
+              </w:rPr>
+              <w:t xml:space="preserve">: Pandas </w:t>
+            </w:r>
+            <w:proofErr w:type="spellStart"/>
+            <w:r>
+              <w:rPr>
+                <w:sz w:val="20"/>
+                <w:szCs w:val="20"/>
+              </w:rPr>
+              <w:t>groupby</w:t>
+            </w:r>
+            <w:proofErr w:type="spellEnd"/>
           </w:p>
         </w:tc>
       </w:tr>
@@ -5259,13 +5723,24 @@
                 <w:szCs w:val="20"/>
               </w:rPr>
             </w:pPr>
-            <w:r>
-              <w:rPr>
-                <w:sz w:val="20"/>
-                <w:szCs w:val="20"/>
-              </w:rPr>
-              <w:t>Tensors, N-dimensional arrays</w:t>
-            </w:r>
+            <w:hyperlink r:id="rId19" w:history="1">
+              <w:r>
+                <w:rPr>
+                  <w:rStyle w:val="Hyperlink"/>
+                  <w:sz w:val="20"/>
+                  <w:szCs w:val="20"/>
+                </w:rPr>
+                <w:t>Mapping</w:t>
+              </w:r>
+              <w:r>
+                <w:rPr>
+                  <w:rStyle w:val="Hyperlink"/>
+                  <w:sz w:val="20"/>
+                  <w:szCs w:val="20"/>
+                </w:rPr>
+                <w:t>, N-dimensional arrays</w:t>
+              </w:r>
+            </w:hyperlink>
           </w:p>
         </w:tc>
         <w:tc>
@@ -5284,7 +5759,46 @@
                 <w:sz w:val="20"/>
                 <w:szCs w:val="20"/>
               </w:rPr>
-              <w:t>More Xarray, Zarr</w:t>
+              <w:t xml:space="preserve">More </w:t>
+            </w:r>
+            <w:proofErr w:type="spellStart"/>
+            <w:r>
+              <w:rPr>
+                <w:sz w:val="20"/>
+                <w:szCs w:val="20"/>
+              </w:rPr>
+              <w:t>Xarray</w:t>
+            </w:r>
+            <w:proofErr w:type="spellEnd"/>
+            <w:r>
+              <w:rPr>
+                <w:sz w:val="20"/>
+                <w:szCs w:val="20"/>
+              </w:rPr>
+              <w:t xml:space="preserve">, </w:t>
+            </w:r>
+            <w:proofErr w:type="spellStart"/>
+            <w:r>
+              <w:rPr>
+                <w:sz w:val="20"/>
+                <w:szCs w:val="20"/>
+              </w:rPr>
+              <w:t>Cartopy</w:t>
+            </w:r>
+            <w:proofErr w:type="spellEnd"/>
+            <w:r>
+              <w:rPr>
+                <w:sz w:val="20"/>
+                <w:szCs w:val="20"/>
+              </w:rPr>
+              <w:t xml:space="preserve">, </w:t>
+            </w:r>
+            <w:r>
+              <w:rPr>
+                <w:sz w:val="20"/>
+                <w:szCs w:val="20"/>
+              </w:rPr>
+              <w:t>Zarr</w:t>
             </w:r>
             <w:r>
               <w:rPr>
@@ -5310,9 +5824,24 @@
               <w:rPr>
                 <w:sz w:val="20"/>
                 <w:szCs w:val="20"/>
-                <w:highlight w:val="yellow"/>
-              </w:rPr>
-              <w:t>Assignment 10: Xarray basics</w:t>
+              </w:rPr>
+              <w:t xml:space="preserve">Assignment 10: </w:t>
+            </w:r>
+            <w:proofErr w:type="spellStart"/>
+            <w:r>
+              <w:rPr>
+                <w:sz w:val="20"/>
+                <w:szCs w:val="20"/>
+              </w:rPr>
+              <w:t>Xarray</w:t>
+            </w:r>
+            <w:proofErr w:type="spellEnd"/>
+            <w:r>
+              <w:rPr>
+                <w:sz w:val="20"/>
+                <w:szCs w:val="20"/>
+              </w:rPr>
+              <w:t xml:space="preserve"> basics</w:t>
             </w:r>
           </w:p>
         </w:tc>
@@ -5373,13 +5902,16 @@
                 <w:szCs w:val="20"/>
               </w:rPr>
             </w:pPr>
-            <w:r>
-              <w:rPr>
-                <w:sz w:val="20"/>
-                <w:szCs w:val="20"/>
-              </w:rPr>
-              <w:t>Climate model data</w:t>
-            </w:r>
+            <w:hyperlink r:id="rId20" w:history="1">
+              <w:r>
+                <w:rPr>
+                  <w:rStyle w:val="Hyperlink"/>
+                  <w:sz w:val="20"/>
+                  <w:szCs w:val="20"/>
+                </w:rPr>
+                <w:t>Climate model data</w:t>
+              </w:r>
+            </w:hyperlink>
           </w:p>
         </w:tc>
         <w:tc>
@@ -5417,10 +5949,18 @@
               <w:rPr>
                 <w:sz w:val="20"/>
                 <w:szCs w:val="20"/>
-                <w:highlight w:val="yellow"/>
-              </w:rPr>
-              <w:t>Assignment 11: More Xarray</w:t>
-            </w:r>
+              </w:rPr>
+              <w:t xml:space="preserve">Assignment 11: More </w:t>
+            </w:r>
+            <w:proofErr w:type="spellStart"/>
+            <w:r>
+              <w:rPr>
+                <w:sz w:val="20"/>
+                <w:szCs w:val="20"/>
+              </w:rPr>
+              <w:t>Xarray</w:t>
+            </w:r>
+            <w:proofErr w:type="spellEnd"/>
           </w:p>
         </w:tc>
       </w:tr>
@@ -5587,7 +6127,21 @@
         <w:rPr>
           <w:rFonts w:asciiTheme="majorHAnsi" w:eastAsia="Calibri" w:hAnsiTheme="majorHAnsi" w:cstheme="majorHAnsi"/>
         </w:rPr>
-        <w:t>The Climate School aims to advance knowledge and educate leaders for equitable solutions to climate and sustainability challenges. Using an interdisciplinary approach, the School encourages engagement of diverse perspectives on climate variability and its impacts. The classroom should be a welcoming environment where a variety of perspectives and lived experiences enable us to collaboratively define challenges and identify solutions.</w:t>
+        <w:t xml:space="preserve">The Climate School aims to advance knowledge and educate leaders for equitable solutions to climate and sustainability challenges. Using an interdisciplinary approach, the </w:t>
+      </w:r>
+      <w:proofErr w:type="gramStart"/>
+      <w:r>
+        <w:rPr>
+          <w:rFonts w:asciiTheme="majorHAnsi" w:eastAsia="Calibri" w:hAnsiTheme="majorHAnsi" w:cstheme="majorHAnsi"/>
+        </w:rPr>
+        <w:t>School</w:t>
+      </w:r>
+      <w:proofErr w:type="gramEnd"/>
+      <w:r>
+        <w:rPr>
+          <w:rFonts w:asciiTheme="majorHAnsi" w:eastAsia="Calibri" w:hAnsiTheme="majorHAnsi" w:cstheme="majorHAnsi"/>
+        </w:rPr>
+        <w:t xml:space="preserve"> encourages engagement of diverse perspectives on climate variability and its impacts. The classroom should be a welcoming environment where a variety of perspectives and lived experiences enable us to collaboratively define challenges and identify solutions.</w:t>
       </w:r>
     </w:p>
     <w:p>
@@ -5636,8 +6190,8 @@
         </w:rPr>
         <w:t>Should you wish to discuss the School's environment or your engagement inside or outside of the classroom, please do not hesitate to contact Willie Williams (Assistant Dean for Inclusive Excellence) at 332.277.3697 or</w:t>
       </w:r>
-      <w:hyperlink r:id="rId10" w:history="1">
-        <w:hyperlink r:id="rId11" w:history="1">
+      <w:hyperlink r:id="rId21" w:history="1">
+        <w:hyperlink r:id="rId22" w:history="1">
           <w:r>
             <w:rPr>
               <w:rStyle w:val="Hyperlink"/>
@@ -5711,7 +6265,7 @@
         </w:rPr>
         <w:t xml:space="preserve">You deserve to be addressed in a manner that reflects your identity.  Please see </w:t>
       </w:r>
-      <w:hyperlink r:id="rId12" w:history="1">
+      <w:hyperlink r:id="rId23" w:history="1">
         <w:r>
           <w:rPr>
             <w:rStyle w:val="Hyperlink"/>
@@ -5934,7 +6488,7 @@
         </w:rPr>
         <w:t xml:space="preserve">Mental and physical health is important while undergoing graduate studies. While maintaining good health is a priority, occasional stress is an unavoidable part of a graduate education. Please know that there are resources on campus to help you cope with the pressures of student life. These include support groups and workshops on managing stress, healthy eating and life management. For resources for coping with stress, anxiety, and other specific health related concerns, please visit </w:t>
       </w:r>
-      <w:hyperlink r:id="rId13" w:history="1">
+      <w:hyperlink r:id="rId24" w:history="1">
         <w:r>
           <w:rPr>
             <w:rStyle w:val="Hyperlink"/>
@@ -6010,7 +6564,7 @@
         </w:rPr>
         <w:t xml:space="preserve">In order to receive disability-related academic accommodations, students must first be registered with the Office of Disability Services (ODS). More information on the ODS registration process is available online at </w:t>
       </w:r>
-      <w:hyperlink r:id="rId14" w:history="1">
+      <w:hyperlink r:id="rId25" w:history="1">
         <w:r>
           <w:rPr>
             <w:rStyle w:val="Hyperlink"/>
@@ -6038,9 +6592,23 @@
         <w:rPr>
           <w:rFonts w:asciiTheme="majorHAnsi" w:eastAsia="Calibri" w:hAnsiTheme="majorHAnsi" w:cstheme="majorHAnsi"/>
         </w:rPr>
-        <w:t>Students who have, or think they may have, a disability are invited to contact ODS for a confidential discussion at 212.854.2388 (V) 212.854.2378 (TTY), or by email at disability@columbia.edu. If you have already registered with ODS and would like your professor(s) notified of your recommended accommodations, contact Natalie Unwin-Kuruneri (</w:t>
-      </w:r>
-      <w:hyperlink r:id="rId15" w:history="1">
+        <w:t>Students who have, or think they may have, a disability are invited to contact ODS for a confidential discussion at 212.854.2388 (V) 212.854.2378 (TTY), or by email at disability@columbia.edu. If you have already registered with ODS and would like your professor(s) notified of your recommended accommodations, contact Natalie Unwin-</w:t>
+      </w:r>
+      <w:proofErr w:type="spellStart"/>
+      <w:r>
+        <w:rPr>
+          <w:rFonts w:asciiTheme="majorHAnsi" w:eastAsia="Calibri" w:hAnsiTheme="majorHAnsi" w:cstheme="majorHAnsi"/>
+        </w:rPr>
+        <w:t>Kuruneri</w:t>
+      </w:r>
+      <w:proofErr w:type="spellEnd"/>
+      <w:r>
+        <w:rPr>
+          <w:rFonts w:asciiTheme="majorHAnsi" w:eastAsia="Calibri" w:hAnsiTheme="majorHAnsi" w:cstheme="majorHAnsi"/>
+        </w:rPr>
+        <w:t xml:space="preserve"> (</w:t>
+      </w:r>
+      <w:hyperlink r:id="rId26" w:history="1">
         <w:r>
           <w:rPr>
             <w:rStyle w:val="Hyperlink"/>
@@ -6123,7 +6691,7 @@
         </w:rPr>
         <w:t xml:space="preserve">The Columbia Climate School holds each member of its community responsible for understanding and abiding by the </w:t>
       </w:r>
-      <w:hyperlink r:id="rId16" w:history="1">
+      <w:hyperlink r:id="rId27" w:history="1">
         <w:r>
           <w:rPr>
             <w:rStyle w:val="Hyperlink"/>
@@ -6160,7 +6728,7 @@
         </w:rPr>
         <w:t xml:space="preserve">Students should be aware that academic dishonesty (for example, plagiarism, cheating on an examination, or dishonesty in dealing with a faculty member or other university official) are particularly serious offenses and will be dealt with severely under </w:t>
       </w:r>
-      <w:hyperlink r:id="rId17">
+      <w:hyperlink r:id="rId28">
         <w:r>
           <w:rPr>
             <w:rFonts w:asciiTheme="majorHAnsi" w:eastAsia="Calibri" w:hAnsiTheme="majorHAnsi" w:cstheme="majorHAnsi"/>
@@ -6398,7 +6966,7 @@
         </w:rPr>
         <w:t xml:space="preserve">Columbia’s extensive library system ranks in the top five academic libraries in the nation, with many of its services and resources available online: </w:t>
       </w:r>
-      <w:hyperlink r:id="rId18" w:history="1">
+      <w:hyperlink r:id="rId29" w:history="1">
         <w:r>
           <w:rPr>
             <w:rStyle w:val="Hyperlink"/>
@@ -6470,7 +7038,7 @@
         </w:rPr>
         <w:t xml:space="preserve">The </w:t>
       </w:r>
-      <w:hyperlink r:id="rId19" w:history="1">
+      <w:hyperlink r:id="rId30" w:history="1">
         <w:r>
           <w:rPr>
             <w:rStyle w:val="Hyperlink"/>
@@ -6486,7 +7054,7 @@
         </w:rPr>
         <w:t xml:space="preserve"> aids undergraduate and graduate students with writing consultations for specific writing projects, writing productivity sessions, and workshops. The Writing Center offers these services for free to current Columbia students. Read more about their services on their </w:t>
       </w:r>
-      <w:hyperlink r:id="rId20" w:history="1">
+      <w:hyperlink r:id="rId31" w:history="1">
         <w:r>
           <w:rPr>
             <w:rStyle w:val="Hyperlink"/>
@@ -6502,7 +7070,7 @@
         </w:rPr>
         <w:t xml:space="preserve">. You can also contact the center at </w:t>
       </w:r>
-      <w:hyperlink r:id="rId21" w:history="1">
+      <w:hyperlink r:id="rId32" w:history="1">
         <w:r>
           <w:rPr>
             <w:rStyle w:val="Hyperlink"/>
@@ -6529,7 +7097,7 @@
       </w:pPr>
     </w:p>
     <w:sectPr>
-      <w:footerReference w:type="default" r:id="rId22"/>
+      <w:footerReference w:type="default" r:id="rId33"/>
       <w:pgSz w:w="11900" w:h="16840"/>
       <w:pgMar w:top="1425" w:right="1380" w:bottom="1620" w:left="1441" w:header="0" w:footer="720" w:gutter="0"/>
       <w:pgNumType w:start="1"/>

</xml_diff>